<commit_message>
Refresh submission packet for v4.2 + add launch checklist to ZIP
Rebuilds the upload ZIP and proceeding notes against the current v4.2 paper
(after upstream cleanup) and adds the now-present Recruiting Launch Checklist
as the 10th attachment. Clears the previously-flagged 'missing checklist'
note; documents v4.2 as a non-substantive cleanup. Regenerates
ALL_IN_ONE_DBA_Package_v3.docx from current sources.

Committee-defense DRAFT notes intentionally kept OUT of the advisor packet
(internal pre-defense method review, not a pilot-blocker).
</commit_message>
<xml_diff>
--- a/dba/ALL_IN_ONE_DBA_Package_v3.docx
+++ b/dba/ALL_IN_ONE_DBA_Package_v3.docx
@@ -892,44 +892,6 @@
         <w:t xml:space="preserve"> literature already theorizes professional skepticism and judgment quality (Nelson, 2009; Nelson &amp; Tan, 2005), which preserves continuity with the validated instruments the study adapts. The selective-accessibility, belief-adjustment, and audit-quality frameworks are retained as supporting theory wherever a specific construct's mechanism is better described by them.</w:t>
       </w:r>
     </w:p>
-    <w:tbl>
-      <w:tblPr>
-        <w:tblStyle w:val="TableGrid"/>
-        <w:tblW w:type="auto" w:w="0"/>
-        <w:tblLook w:firstColumn="1" w:firstRow="1" w:lastColumn="0" w:lastRow="0" w:noHBand="0" w:noVBand="1" w:val="04A0"/>
-      </w:tblPr>
-      <w:tblGrid>
-        <w:gridCol w:w="9360"/>
-      </w:tblGrid>
-      <w:tr>
-        <w:tc>
-          <w:tcPr>
-            <w:tcW w:type="dxa" w:w="9360"/>
-            <w:shd w:val="clear" w:color="auto" w:fill="FFF8E1"/>
-          </w:tcPr>
-          <w:p>
-            <w:pPr>
-              <w:spacing w:line="240" w:lineRule="auto" w:after="40"/>
-            </w:pPr>
-            <w:r/>
-            <w:r>
-              <w:rPr>
-                <w:b/>
-              </w:rPr>
-              <w:t>Optional further reading.</w:t>
-            </w:r>
-            <w:r>
-              <w:t xml:space="preserve"> Several seminal anchoring and audit-JDM sources have been integrated above (Wilson et al., 1996; Mussweiler &amp; Strack, 1999; Lord et al., 1984; Kahneman &amp; Frederick, 2002; Northcraft &amp; Neale, 1987). To deepen the theory treatment further, consider adding: Mussweiler, Strack, &amp; Pfeiffer (2000) on overcoming anchoring; Stanovich and West (2000) on individual differences in System-2 engagement; and Nelson (2009) on the audit-skepticism theoretical map.</w:t>
-            </w:r>
-          </w:p>
-        </w:tc>
-      </w:tr>
-    </w:tbl>
-    <w:p>
-      <w:pPr>
-        <w:spacing w:after="0"/>
-      </w:pPr>
-    </w:p>
     <w:p>
       <w:pPr>
         <w:pStyle w:val="Heading2"/>
@@ -998,44 +960,6 @@
         <w:t>A central tension in this literature is whether expertise and accountability attenuate anchoring. Some studies find that experienced auditors are less susceptible than novices, while others find professionals fully susceptible; Kennedy (1993) shows that accountability reduces some judgment biases only when the bias originates in insufficient effort rather than in data or memory limitations — implying that anchoring is reducible only by interventions matched to its actual cognitive source. This unresolved boundary condition is the gap the present model addresses by testing eight interventions simultaneously rather than in isolation.</w:t>
       </w:r>
     </w:p>
-    <w:tbl>
-      <w:tblPr>
-        <w:tblStyle w:val="TableGrid"/>
-        <w:tblW w:type="auto" w:w="0"/>
-        <w:tblLook w:firstColumn="1" w:firstRow="1" w:lastColumn="0" w:lastRow="0" w:noHBand="0" w:noVBand="1" w:val="04A0"/>
-      </w:tblPr>
-      <w:tblGrid>
-        <w:gridCol w:w="9360"/>
-      </w:tblGrid>
-      <w:tr>
-        <w:tc>
-          <w:tcPr>
-            <w:tcW w:type="dxa" w:w="9360"/>
-            <w:shd w:val="clear" w:color="auto" w:fill="FFF8E1"/>
-          </w:tcPr>
-          <w:p>
-            <w:pPr>
-              <w:spacing w:line="240" w:lineRule="auto" w:after="40"/>
-            </w:pPr>
-            <w:r/>
-            <w:r>
-              <w:rPr>
-                <w:b/>
-              </w:rPr>
-              <w:t>Optional further reading.</w:t>
-            </w:r>
-            <w:r>
-              <w:t xml:space="preserve"> Consider: Pike's (2024+) work on mitigating auditor bias through elaboration; Cianci &amp; Bierstaker on fair-value anchoring; and recent meta-analytic syntheses of debiasing effectiveness in professional populations.</w:t>
-            </w:r>
-          </w:p>
-        </w:tc>
-      </w:tr>
-    </w:tbl>
-    <w:p>
-      <w:pPr>
-        <w:spacing w:after="0"/>
-      </w:pPr>
-    </w:p>
     <w:p>
       <w:pPr>
         <w:pStyle w:val="Heading2"/>
@@ -1144,44 +1068,6 @@
         <w:t>.</w:t>
       </w:r>
     </w:p>
-    <w:tbl>
-      <w:tblPr>
-        <w:tblStyle w:val="TableGrid"/>
-        <w:tblW w:type="auto" w:w="0"/>
-        <w:tblLook w:firstColumn="1" w:firstRow="1" w:lastColumn="0" w:lastRow="0" w:noHBand="0" w:noVBand="1" w:val="04A0"/>
-      </w:tblPr>
-      <w:tblGrid>
-        <w:gridCol w:w="9360"/>
-      </w:tblGrid>
-      <w:tr>
-        <w:tc>
-          <w:tcPr>
-            <w:tcW w:type="dxa" w:w="9360"/>
-            <w:shd w:val="clear" w:color="auto" w:fill="FFF8E1"/>
-          </w:tcPr>
-          <w:p>
-            <w:pPr>
-              <w:spacing w:line="240" w:lineRule="auto" w:after="40"/>
-            </w:pPr>
-            <w:r/>
-            <w:r>
-              <w:rPr>
-                <w:b/>
-              </w:rPr>
-              <w:t>Optional further reading.</w:t>
-            </w:r>
-            <w:r>
-              <w:t xml:space="preserve"> Hurtt et al. (2013) and Solomon and Trotman (2003) have been integrated above. To deepen further, consider: Nolder and Kadous on skepticism mindset; Westermann, Cohen, and Trompeter on skepticism in practice; and recent transfer-of-training studies on audit-context bias interventions.</w:t>
-            </w:r>
-          </w:p>
-        </w:tc>
-      </w:tr>
-    </w:tbl>
-    <w:p>
-      <w:pPr>
-        <w:spacing w:after="0"/>
-      </w:pPr>
-    </w:p>
     <w:p>
       <w:pPr>
         <w:pStyle w:val="Heading2"/>
@@ -1281,44 +1167,6 @@
         <w:t xml:space="preserve"> anchors while introducing its own costs (lost client-specific knowledge, start-up inefficiency), and the net direction is an empirical question this model is designed to estimate.</w:t>
       </w:r>
     </w:p>
-    <w:tbl>
-      <w:tblPr>
-        <w:tblStyle w:val="TableGrid"/>
-        <w:tblW w:type="auto" w:w="0"/>
-        <w:tblLook w:firstColumn="1" w:firstRow="1" w:lastColumn="0" w:lastRow="0" w:noHBand="0" w:noVBand="1" w:val="04A0"/>
-      </w:tblPr>
-      <w:tblGrid>
-        <w:gridCol w:w="9360"/>
-      </w:tblGrid>
-      <w:tr>
-        <w:tc>
-          <w:tcPr>
-            <w:tcW w:type="dxa" w:w="9360"/>
-            <w:shd w:val="clear" w:color="auto" w:fill="FFF8E1"/>
-          </w:tcPr>
-          <w:p>
-            <w:pPr>
-              <w:spacing w:line="240" w:lineRule="auto" w:after="40"/>
-            </w:pPr>
-            <w:r/>
-            <w:r>
-              <w:rPr>
-                <w:b/>
-              </w:rPr>
-              <w:t>Optional further reading.</w:t>
-            </w:r>
-            <w:r>
-              <w:t xml:space="preserve"> Carcello &amp; Nagy (2004) and Myers, Myers, &amp; Omer (2003) have been integrated. To deepen further, consider: Cameran, Prencipe, &amp; Trombetta on mandatory rotation in the EU; Bell, Causholli, &amp; Knechel on tenure and audit quality; and Daugherty et al. on partner rotation effects on familiarity threat.</w:t>
-            </w:r>
-          </w:p>
-        </w:tc>
-      </w:tr>
-    </w:tbl>
-    <w:p>
-      <w:pPr>
-        <w:spacing w:after="0"/>
-      </w:pPr>
-    </w:p>
     <w:p>
       <w:pPr>
         <w:pStyle w:val="Heading2"/>
@@ -1391,44 +1239,6 @@
         <w:t xml:space="preserve"> an anchor (e.g., a default risk score) as readily as a good tool removes one. Analytical tools, in other words, are debiasing only insofar as they direct attention to anchor-inconsistent evidence; when they present a salient default or prior-year benchmark, they risk re-anchoring the auditor. This double-edged quality is why AT is modeled as an intervention whose effect must be estimated empirically rather than assumed.</w:t>
       </w:r>
     </w:p>
-    <w:tbl>
-      <w:tblPr>
-        <w:tblStyle w:val="TableGrid"/>
-        <w:tblW w:type="auto" w:w="0"/>
-        <w:tblLook w:firstColumn="1" w:firstRow="1" w:lastColumn="0" w:lastRow="0" w:noHBand="0" w:noVBand="1" w:val="04A0"/>
-      </w:tblPr>
-      <w:tblGrid>
-        <w:gridCol w:w="9360"/>
-      </w:tblGrid>
-      <w:tr>
-        <w:tc>
-          <w:tcPr>
-            <w:tcW w:type="dxa" w:w="9360"/>
-            <w:shd w:val="clear" w:color="auto" w:fill="FFF8E1"/>
-          </w:tcPr>
-          <w:p>
-            <w:pPr>
-              <w:spacing w:line="240" w:lineRule="auto" w:after="40"/>
-            </w:pPr>
-            <w:r/>
-            <w:r>
-              <w:rPr>
-                <w:b/>
-              </w:rPr>
-              <w:t>Optional further reading.</w:t>
-            </w:r>
-            <w:r>
-              <w:t xml:space="preserve"> Vasarhelyi, Alles, &amp; Kogan (2004) has been integrated above. To deepen further, consider: Earley on data-analytic skills in auditing; Krieger, Drews, &amp; Velte on audit data analytics outcomes; and the automation-bias literature applied to audit decision aids.</w:t>
-            </w:r>
-          </w:p>
-        </w:tc>
-      </w:tr>
-    </w:tbl>
-    <w:p>
-      <w:pPr>
-        <w:spacing w:after="0"/>
-      </w:pPr>
-    </w:p>
     <w:p>
       <w:pPr>
         <w:pStyle w:val="Heading2"/>
@@ -1501,44 +1311,6 @@
         <w:t xml:space="preserve"> of evidence evaluation, but not when it merely adds documentation around an unchanged thought process. This makes SAP a procedural-rigor lever, which is why Chapter 3 routes it through the Audit Process Rigor mediator.</w:t>
       </w:r>
     </w:p>
-    <w:tbl>
-      <w:tblPr>
-        <w:tblStyle w:val="TableGrid"/>
-        <w:tblW w:type="auto" w:w="0"/>
-        <w:tblLook w:firstColumn="1" w:firstRow="1" w:lastColumn="0" w:lastRow="0" w:noHBand="0" w:noVBand="1" w:val="04A0"/>
-      </w:tblPr>
-      <w:tblGrid>
-        <w:gridCol w:w="9360"/>
-      </w:tblGrid>
-      <w:tr>
-        <w:tc>
-          <w:tcPr>
-            <w:tcW w:type="dxa" w:w="9360"/>
-            <w:shd w:val="clear" w:color="auto" w:fill="FFF8E1"/>
-          </w:tcPr>
-          <w:p>
-            <w:pPr>
-              <w:spacing w:line="240" w:lineRule="auto" w:after="40"/>
-            </w:pPr>
-            <w:r/>
-            <w:r>
-              <w:rPr>
-                <w:b/>
-              </w:rPr>
-              <w:t>Optional further reading.</w:t>
-            </w:r>
-            <w:r>
-              <w:t xml:space="preserve"> Carpenter (2007) and Trotman, Bauer, &amp; Humphreys (2015) have been integrated above. To deepen further, consider: Bell, Solomon, &amp; colleagues on the strategic-systems audit approach; Mock &amp; Wright on audit-program structure; and the mechanization-vs-judgment debate in audit-methodology research.</w:t>
-            </w:r>
-          </w:p>
-        </w:tc>
-      </w:tr>
-    </w:tbl>
-    <w:p>
-      <w:pPr>
-        <w:spacing w:after="0"/>
-      </w:pPr>
-    </w:p>
     <w:p>
       <w:pPr>
         <w:pStyle w:val="Heading2"/>
@@ -1602,44 +1374,6 @@
         <w:t xml:space="preserve"> feedback and structured reflection over outcome feedback (Bonner, 2008; Kennedy, 1993). The contradiction to manage is that reflection can also rationalize a prior-year anchor after the fact rather than dislodge it; feedback is debiasing only when it is structured to compare the auditor's judgment against independent evidence, not against the anchor itself.</w:t>
       </w:r>
     </w:p>
-    <w:tbl>
-      <w:tblPr>
-        <w:tblStyle w:val="TableGrid"/>
-        <w:tblW w:type="auto" w:w="0"/>
-        <w:tblLook w:firstColumn="1" w:firstRow="1" w:lastColumn="0" w:lastRow="0" w:noHBand="0" w:noVBand="1" w:val="04A0"/>
-      </w:tblPr>
-      <w:tblGrid>
-        <w:gridCol w:w="9360"/>
-      </w:tblGrid>
-      <w:tr>
-        <w:tc>
-          <w:tcPr>
-            <w:tcW w:type="dxa" w:w="9360"/>
-            <w:shd w:val="clear" w:color="auto" w:fill="FFF8E1"/>
-          </w:tcPr>
-          <w:p>
-            <w:pPr>
-              <w:spacing w:line="240" w:lineRule="auto" w:after="40"/>
-            </w:pPr>
-            <w:r/>
-            <w:r>
-              <w:rPr>
-                <w:b/>
-              </w:rPr>
-              <w:t>Optional further reading.</w:t>
-            </w:r>
-            <w:r>
-              <w:t xml:space="preserve"> Lord, Lepper, &amp; Preston (1984) and Mussweiler &amp; Strack (1999) have been integrated above. To deepen further, consider: Peecher's work on audit-quality outcome bias; Mala &amp; Chand on JDM feedback effects in auditing; and Bonner's treatment of process vs. outcome feedback.</w:t>
-            </w:r>
-          </w:p>
-        </w:tc>
-      </w:tr>
-    </w:tbl>
-    <w:p>
-      <w:pPr>
-        <w:spacing w:after="0"/>
-      </w:pPr>
-    </w:p>
     <w:p>
       <w:pPr>
         <w:pStyle w:val="Heading2"/>
@@ -1730,44 +1464,6 @@
         <w:t>, which is why it is modeled (with SAP) as a driver of Audit Process Rigor rather than a purely cognitive lever.</w:t>
       </w:r>
     </w:p>
-    <w:tbl>
-      <w:tblPr>
-        <w:tblStyle w:val="TableGrid"/>
-        <w:tblW w:type="auto" w:w="0"/>
-        <w:tblLook w:firstColumn="1" w:firstRow="1" w:lastColumn="0" w:lastRow="0" w:noHBand="0" w:noVBand="1" w:val="04A0"/>
-      </w:tblPr>
-      <w:tblGrid>
-        <w:gridCol w:w="9360"/>
-      </w:tblGrid>
-      <w:tr>
-        <w:tc>
-          <w:tcPr>
-            <w:tcW w:type="dxa" w:w="9360"/>
-            <w:shd w:val="clear" w:color="auto" w:fill="FFF8E1"/>
-          </w:tcPr>
-          <w:p>
-            <w:pPr>
-              <w:spacing w:line="240" w:lineRule="auto" w:after="40"/>
-            </w:pPr>
-            <w:r/>
-            <w:r>
-              <w:rPr>
-                <w:b/>
-              </w:rPr>
-              <w:t>Optional further reading.</w:t>
-            </w:r>
-            <w:r>
-              <w:t xml:space="preserve"> Tan &amp; Trotman (2003) and Solomon &amp; Trotman (2003) have been integrated above. To deepen further, consider: Agoglia, Brazel, &amp; Hatfield on justification memos; Gibbins &amp; Trotman on audit-review effectiveness; and Owhoso, Messier, &amp; Lynch on engagement-quality review.</w:t>
-            </w:r>
-          </w:p>
-        </w:tc>
-      </w:tr>
-    </w:tbl>
-    <w:p>
-      <w:pPr>
-        <w:spacing w:after="0"/>
-      </w:pPr>
-    </w:p>
     <w:p>
       <w:pPr>
         <w:pStyle w:val="Heading2"/>
@@ -1840,44 +1536,6 @@
         <w:t>. The construct therefore captures a regulatory-pressure mechanism whose effect on anchoring is plausibly positive but, as the inspection literature suggests, far from guaranteed — an empirical question the model is designed to answer.</w:t>
       </w:r>
     </w:p>
-    <w:tbl>
-      <w:tblPr>
-        <w:tblStyle w:val="TableGrid"/>
-        <w:tblW w:type="auto" w:w="0"/>
-        <w:tblLook w:firstColumn="1" w:firstRow="1" w:lastColumn="0" w:lastRow="0" w:noHBand="0" w:noVBand="1" w:val="04A0"/>
-      </w:tblPr>
-      <w:tblGrid>
-        <w:gridCol w:w="9360"/>
-      </w:tblGrid>
-      <w:tr>
-        <w:tc>
-          <w:tcPr>
-            <w:tcW w:type="dxa" w:w="9360"/>
-            <w:shd w:val="clear" w:color="auto" w:fill="FFF8E1"/>
-          </w:tcPr>
-          <w:p>
-            <w:pPr>
-              <w:spacing w:line="240" w:lineRule="auto" w:after="40"/>
-            </w:pPr>
-            <w:r/>
-            <w:r>
-              <w:rPr>
-                <w:b/>
-              </w:rPr>
-              <w:t>Optional further reading.</w:t>
-            </w:r>
-            <w:r>
-              <w:t xml:space="preserve"> Francis (2011) and Tan &amp; Kao (1999) have been integrated above. To deepen further, consider: DeFond &amp; Zhang's (2014) review of audit-research evidence on audit quality; PCAOB inspection-report syntheses; and Glover &amp; Prawitt on the documentation-vs-judgment trade-off.</w:t>
-            </w:r>
-          </w:p>
-        </w:tc>
-      </w:tr>
-    </w:tbl>
-    <w:p>
-      <w:pPr>
-        <w:spacing w:after="0"/>
-      </w:pPr>
-    </w:p>
     <w:p>
       <w:pPr>
         <w:pStyle w:val="Heading2"/>
@@ -1959,44 +1617,6 @@
         <w:t xml:space="preserve"> the prior-year anchor by rewarding speed and continuity over independent reconsideration. PMI is thus modeled as a motivational lever whose sign and magnitude depend on what, exactly, the metrics reward.</w:t>
       </w:r>
     </w:p>
-    <w:tbl>
-      <w:tblPr>
-        <w:tblStyle w:val="TableGrid"/>
-        <w:tblW w:type="auto" w:w="0"/>
-        <w:tblLook w:firstColumn="1" w:firstRow="1" w:lastColumn="0" w:lastRow="0" w:noHBand="0" w:noVBand="1" w:val="04A0"/>
-      </w:tblPr>
-      <w:tblGrid>
-        <w:gridCol w:w="9360"/>
-      </w:tblGrid>
-      <w:tr>
-        <w:tc>
-          <w:tcPr>
-            <w:tcW w:type="dxa" w:w="9360"/>
-            <w:shd w:val="clear" w:color="auto" w:fill="FFF8E1"/>
-          </w:tcPr>
-          <w:p>
-            <w:pPr>
-              <w:spacing w:line="240" w:lineRule="auto" w:after="40"/>
-            </w:pPr>
-            <w:r/>
-            <w:r>
-              <w:rPr>
-                <w:b/>
-              </w:rPr>
-              <w:t>Optional further reading.</w:t>
-            </w:r>
-            <w:r>
-              <w:t xml:space="preserve"> DeAngelo (1981) and Tan &amp; Kao (1999) have been integrated above. To deepen further, consider: McNamara &amp; Liyanarachchi on audit-quality-threatening behaviors; Coram, Glavovic, Ng, &amp; Woodliff on budget pressure; and Pierce &amp; Sweeney on time-budget effects on audit work.</w:t>
-            </w:r>
-          </w:p>
-        </w:tc>
-      </w:tr>
-    </w:tbl>
-    <w:p>
-      <w:pPr>
-        <w:spacing w:after="0"/>
-      </w:pPr>
-    </w:p>
     <w:p>
       <w:pPr>
         <w:pStyle w:val="Heading2"/>
@@ -2069,44 +1689,6 @@
         <w:t>, which in turn reduces the anchor's influence. Training, rotation, analytical tools, feedback, regulatory pressure, and incentives all plausibly raise the cognitive quality of the judgment — the deployment of knowledge, the engagement of effortful reasoning, the objectivity of the conclusion — and it is this improved judgment that is less anchored. The literature supports treating judgment quality as the cognitive mechanism through which cognitively oriented interventions reach the dependent variable.</w:t>
       </w:r>
     </w:p>
-    <w:tbl>
-      <w:tblPr>
-        <w:tblStyle w:val="TableGrid"/>
-        <w:tblW w:type="auto" w:w="0"/>
-        <w:tblLook w:firstColumn="1" w:firstRow="1" w:lastColumn="0" w:lastRow="0" w:noHBand="0" w:noVBand="1" w:val="04A0"/>
-      </w:tblPr>
-      <w:tblGrid>
-        <w:gridCol w:w="9360"/>
-      </w:tblGrid>
-      <w:tr>
-        <w:tc>
-          <w:tcPr>
-            <w:tcW w:type="dxa" w:w="9360"/>
-            <w:shd w:val="clear" w:color="auto" w:fill="FFF8E1"/>
-          </w:tcPr>
-          <w:p>
-            <w:pPr>
-              <w:spacing w:line="240" w:lineRule="auto" w:after="40"/>
-            </w:pPr>
-            <w:r/>
-            <w:r>
-              <w:rPr>
-                <w:b/>
-              </w:rPr>
-              <w:t>Optional further reading.</w:t>
-            </w:r>
-            <w:r>
-              <w:t xml:space="preserve"> Hurtt et al. (2013) and Trotman, Tan, &amp; Ang (2011) have been integrated above. To deepen further, consider: Quadackers, Groot, &amp; Wright on skepticism-as-trait vs. as-state; Nolder &amp; Kadous on skepticism mindset; and recent extensions of the Libby–Luft framework.</w:t>
-            </w:r>
-          </w:p>
-        </w:tc>
-      </w:tr>
-    </w:tbl>
-    <w:p>
-      <w:pPr>
-        <w:spacing w:after="0"/>
-      </w:pPr>
-    </w:p>
     <w:p>
       <w:pPr>
         <w:pStyle w:val="Heading2"/>
@@ -2196,44 +1778,6 @@
       <w:r>
         <w:t xml:space="preserve"> — through judgment or through process — each intervention reaches the reduction in anchoring bias.</w:t>
       </w:r>
-    </w:p>
-    <w:tbl>
-      <w:tblPr>
-        <w:tblStyle w:val="TableGrid"/>
-        <w:tblW w:type="auto" w:w="0"/>
-        <w:tblLook w:firstColumn="1" w:firstRow="1" w:lastColumn="0" w:lastRow="0" w:noHBand="0" w:noVBand="1" w:val="04A0"/>
-      </w:tblPr>
-      <w:tblGrid>
-        <w:gridCol w:w="9360"/>
-      </w:tblGrid>
-      <w:tr>
-        <w:tc>
-          <w:tcPr>
-            <w:tcW w:type="dxa" w:w="9360"/>
-            <w:shd w:val="clear" w:color="auto" w:fill="FFF8E1"/>
-          </w:tcPr>
-          <w:p>
-            <w:pPr>
-              <w:spacing w:line="240" w:lineRule="auto" w:after="40"/>
-            </w:pPr>
-            <w:r/>
-            <w:r>
-              <w:rPr>
-                <w:b/>
-              </w:rPr>
-              <w:t>Optional further reading.</w:t>
-            </w:r>
-            <w:r>
-              <w:t xml:space="preserve"> Francis (2011) and Trotman, Bauer, &amp; Humphreys (2015) have been integrated above. To deepen further, consider: Aobdia on audit-quality measurement; Bell, Marrs, Solomon, &amp; Thomas on the strategic-systems audit; and Knechel, Krishnan, Pevzner, Shefchik, &amp; Velury's audit-quality framework synthesis.</w:t>
-            </w:r>
-          </w:p>
-        </w:tc>
-      </w:tr>
-    </w:tbl>
-    <w:p>
-      <w:pPr>
-        <w:spacing w:after="0"/>
-      </w:pPr>
     </w:p>
     <w:p>
       <w:pPr>
@@ -3712,16 +3256,16 @@
         <w:pStyle w:val="ListBullet"/>
       </w:pPr>
       <w:r>
-        <w:t xml:space="preserve">Bell, T. B., Peecher, M. E., &amp; Solomon, I. (2005). </w:t>
+        <w:t xml:space="preserve">Bonner, S. E. (2008). </w:t>
       </w:r>
       <w:r>
         <w:rPr>
           <w:i/>
         </w:rPr>
-        <w:t>The 21st century public company audit.</w:t>
-      </w:r>
-      <w:r>
-        <w:t xml:space="preserve"> KPMG LLP.</w:t>
+        <w:t>Judgment and decision making in accounting.</w:t>
+      </w:r>
+      <w:r>
+        <w:t xml:space="preserve"> Prentice Hall.</w:t>
       </w:r>
     </w:p>
     <w:p>
@@ -3729,16 +3273,16 @@
         <w:pStyle w:val="ListBullet"/>
       </w:pPr>
       <w:r>
-        <w:t xml:space="preserve">Bonner, S. E. (2008). </w:t>
+        <w:t xml:space="preserve">Bonner, S. E., &amp; Sprinkle, G. B. (2002). The effects of monetary incentives on effort and task performance. </w:t>
       </w:r>
       <w:r>
         <w:rPr>
           <w:i/>
         </w:rPr>
-        <w:t>Judgment and decision making in accounting.</w:t>
-      </w:r>
-      <w:r>
-        <w:t xml:space="preserve"> Prentice Hall.</w:t>
+        <w:t>Accounting, Organizations and Society, 27</w:t>
+      </w:r>
+      <w:r>
+        <w:t>(4–5), 303–345.</w:t>
       </w:r>
     </w:p>
     <w:p>
@@ -3746,16 +3290,16 @@
         <w:pStyle w:val="ListBullet"/>
       </w:pPr>
       <w:r>
-        <w:t xml:space="preserve">Bonner, S. E., &amp; Sprinkle, G. B. (2002). The effects of monetary incentives on effort and task performance. </w:t>
+        <w:t xml:space="preserve">Bonner, S. E., &amp; Walker, P. L. (1994). The effects of instruction and experience on the acquisition of auditing knowledge. </w:t>
       </w:r>
       <w:r>
         <w:rPr>
           <w:i/>
         </w:rPr>
-        <w:t>Accounting, Organizations and Society, 27</w:t>
-      </w:r>
-      <w:r>
-        <w:t>(4–5), 303–345.</w:t>
+        <w:t>The Accounting Review, 69</w:t>
+      </w:r>
+      <w:r>
+        <w:t>(1), 157–178.</w:t>
       </w:r>
     </w:p>
     <w:p>
@@ -3763,16 +3307,16 @@
         <w:pStyle w:val="ListBullet"/>
       </w:pPr>
       <w:r>
-        <w:t xml:space="preserve">Bonner, S. E., &amp; Walker, P. L. (1994). The effects of instruction and experience on the acquisition of auditing knowledge. </w:t>
+        <w:t xml:space="preserve">Bowlin, K. O., Hobson, J. L., &amp; Piercey, M. D. (2015). The effects of auditor rotation, professional skepticism, and interactions with managers on audit quality. </w:t>
       </w:r>
       <w:r>
         <w:rPr>
           <w:i/>
         </w:rPr>
-        <w:t>The Accounting Review, 69</w:t>
-      </w:r>
-      <w:r>
-        <w:t>(1), 157–178.</w:t>
+        <w:t>The Accounting Review, 90</w:t>
+      </w:r>
+      <w:r>
+        <w:t>(4), 1363–1393.</w:t>
       </w:r>
     </w:p>
     <w:p>
@@ -3780,16 +3324,16 @@
         <w:pStyle w:val="ListBullet"/>
       </w:pPr>
       <w:r>
-        <w:t xml:space="preserve">Bowlin, K. O., Hobson, J. L., &amp; Piercey, M. D. (2015). The effects of auditor rotation, professional skepticism, and interactions with managers on audit quality. </w:t>
+        <w:t xml:space="preserve">Brazel, J. F., Jones, K. L., &amp; Prawitt, D. F. (2014). Auditors' reactions to inconsistencies between financial and nonfinancial measures. </w:t>
       </w:r>
       <w:r>
         <w:rPr>
           <w:i/>
         </w:rPr>
-        <w:t>The Accounting Review, 90</w:t>
-      </w:r>
-      <w:r>
-        <w:t>(4), 1363–1393.</w:t>
+        <w:t>Auditing: A Journal of Practice &amp; Theory, 33</w:t>
+      </w:r>
+      <w:r>
+        <w:t>(2), 25–44.</w:t>
       </w:r>
     </w:p>
     <w:p>
@@ -3797,16 +3341,16 @@
         <w:pStyle w:val="ListBullet"/>
       </w:pPr>
       <w:r>
-        <w:t xml:space="preserve">Brazel, J. F., Jones, K. L., &amp; Prawitt, D. F. (2014). Auditors' reactions to inconsistencies between financial and nonfinancial measures. </w:t>
+        <w:t xml:space="preserve">Carcello, J. V., &amp; Nagy, A. L. (2004). Audit firm tenure and fraudulent financial reporting. </w:t>
       </w:r>
       <w:r>
         <w:rPr>
           <w:i/>
         </w:rPr>
-        <w:t>Auditing: A Journal of Practice &amp; Theory, 33</w:t>
-      </w:r>
-      <w:r>
-        <w:t>(2), 25–44.</w:t>
+        <w:t>Auditing: A Journal of Practice &amp; Theory, 23</w:t>
+      </w:r>
+      <w:r>
+        <w:t>(2), 55–69.</w:t>
       </w:r>
     </w:p>
     <w:p>
@@ -3814,16 +3358,16 @@
         <w:pStyle w:val="ListBullet"/>
       </w:pPr>
       <w:r>
-        <w:t xml:space="preserve">Carcello, J. V., &amp; Nagy, A. L. (2004). Audit firm tenure and fraudulent financial reporting. </w:t>
+        <w:t xml:space="preserve">Carpenter, T. D. (2007). Audit team brainstorming, fraud risk identification, and fraud risk assessment: Implications of SAS No. 99. </w:t>
       </w:r>
       <w:r>
         <w:rPr>
           <w:i/>
         </w:rPr>
-        <w:t>Auditing: A Journal of Practice &amp; Theory, 23</w:t>
-      </w:r>
-      <w:r>
-        <w:t>(2), 55–69.</w:t>
+        <w:t>The Accounting Review, 82</w:t>
+      </w:r>
+      <w:r>
+        <w:t>(5), 1119–1140.</w:t>
       </w:r>
     </w:p>
     <w:p>
@@ -3831,16 +3375,16 @@
         <w:pStyle w:val="ListBullet"/>
       </w:pPr>
       <w:r>
-        <w:t xml:space="preserve">Carpenter, T. D. (2007). Audit team brainstorming, fraud risk identification, and fraud risk assessment: Implications of SAS No. 99. </w:t>
+        <w:t xml:space="preserve">Chen, C. Y., Lin, C. J., &amp; Lin, Y. C. (2016). Audit partner tenure and discretionary accruals. </w:t>
       </w:r>
       <w:r>
         <w:rPr>
           <w:i/>
         </w:rPr>
-        <w:t>The Accounting Review, 82</w:t>
-      </w:r>
-      <w:r>
-        <w:t>(5), 1119–1140.</w:t>
+        <w:t>Contemporary Accounting Research, 33</w:t>
+      </w:r>
+      <w:r>
+        <w:t>(2), 415–445.</w:t>
       </w:r>
     </w:p>
     <w:p>
@@ -3848,16 +3392,16 @@
         <w:pStyle w:val="ListBullet"/>
       </w:pPr>
       <w:r>
-        <w:t xml:space="preserve">Chen, C. Y., Lin, C. J., &amp; Lin, Y. C. (2016). Audit partner tenure and discretionary accruals. </w:t>
+        <w:t xml:space="preserve">Chi, W., Huang, H., Liao, Y., &amp; Xie, H. (2009). Mandatory audit partner rotation and audit quality. </w:t>
       </w:r>
       <w:r>
         <w:rPr>
           <w:i/>
         </w:rPr>
-        <w:t>Contemporary Accounting Research, 33</w:t>
-      </w:r>
-      <w:r>
-        <w:t>(2), 415–445.</w:t>
+        <w:t>Contemporary Accounting Research, 26</w:t>
+      </w:r>
+      <w:r>
+        <w:t>(2), 359–391.</w:t>
       </w:r>
     </w:p>
     <w:p>
@@ -3865,16 +3409,16 @@
         <w:pStyle w:val="ListBullet"/>
       </w:pPr>
       <w:r>
-        <w:t xml:space="preserve">Chi, W., Huang, H., Liao, Y., &amp; Xie, H. (2009). Mandatory audit partner rotation and audit quality. </w:t>
+        <w:t xml:space="preserve">Church, B. K., &amp; Shefchik, L. B. (2012). PCAOB inspections and large accounting firms. </w:t>
       </w:r>
       <w:r>
         <w:rPr>
           <w:i/>
         </w:rPr>
-        <w:t>Contemporary Accounting Research, 26</w:t>
-      </w:r>
-      <w:r>
-        <w:t>(2), 359–391.</w:t>
+        <w:t>Accounting Horizons, 26</w:t>
+      </w:r>
+      <w:r>
+        <w:t>(1), 43–63.</w:t>
       </w:r>
     </w:p>
     <w:p>
@@ -3882,16 +3426,16 @@
         <w:pStyle w:val="ListBullet"/>
       </w:pPr>
       <w:r>
-        <w:t xml:space="preserve">Church, B. K., &amp; Shefchik, L. B. (2012). PCAOB inspections and large accounting firms. </w:t>
+        <w:t xml:space="preserve">DeAngelo, L. E. (1981). Auditor size and audit quality. </w:t>
       </w:r>
       <w:r>
         <w:rPr>
           <w:i/>
         </w:rPr>
-        <w:t>Accounting Horizons, 26</w:t>
-      </w:r>
-      <w:r>
-        <w:t>(1), 43–63.</w:t>
+        <w:t>Journal of Accounting and Economics, 3</w:t>
+      </w:r>
+      <w:r>
+        <w:t>(3), 183–199.</w:t>
       </w:r>
     </w:p>
     <w:p>
@@ -3899,16 +3443,16 @@
         <w:pStyle w:val="ListBullet"/>
       </w:pPr>
       <w:r>
-        <w:t xml:space="preserve">DeAngelo, L. E. (1981). Auditor size and audit quality. </w:t>
+        <w:t xml:space="preserve">DeFond, M. L., &amp; Francis, J. R. (2005). Audit research after Sarbanes-Oxley. </w:t>
       </w:r>
       <w:r>
         <w:rPr>
           <w:i/>
         </w:rPr>
-        <w:t>Journal of Accounting and Economics, 3</w:t>
-      </w:r>
-      <w:r>
-        <w:t>(3), 183–199.</w:t>
+        <w:t>Auditing: A Journal of Practice &amp; Theory, 24</w:t>
+      </w:r>
+      <w:r>
+        <w:t>(s-1), 5–30.</w:t>
       </w:r>
     </w:p>
     <w:p>
@@ -3916,16 +3460,16 @@
         <w:pStyle w:val="ListBullet"/>
       </w:pPr>
       <w:r>
-        <w:t xml:space="preserve">DeFond, M. L., &amp; Francis, J. R. (2005). Audit research after Sarbanes-Oxley. </w:t>
+        <w:t xml:space="preserve">Dowling, C., &amp; Leech, S. A. (2007). Audit support systems and decision aids. </w:t>
       </w:r>
       <w:r>
         <w:rPr>
           <w:i/>
         </w:rPr>
-        <w:t>Auditing: A Journal of Practice &amp; Theory, 24</w:t>
-      </w:r>
-      <w:r>
-        <w:t>(s-1), 5–30.</w:t>
+        <w:t>International Journal of Accounting Information Systems, 8</w:t>
+      </w:r>
+      <w:r>
+        <w:t>(2), 92–116.</w:t>
       </w:r>
     </w:p>
     <w:p>
@@ -3933,16 +3477,16 @@
         <w:pStyle w:val="ListBullet"/>
       </w:pPr>
       <w:r>
-        <w:t xml:space="preserve">Dowling, C., &amp; Leech, S. A. (2007). Audit support systems and decision aids. </w:t>
+        <w:t xml:space="preserve">Earley, C. E. (2001). Knowledge acquisition and knowledge use in auditing. </w:t>
       </w:r>
       <w:r>
         <w:rPr>
           <w:i/>
         </w:rPr>
-        <w:t>International Journal of Accounting Information Systems, 8</w:t>
-      </w:r>
-      <w:r>
-        <w:t>(2), 92–116.</w:t>
+        <w:t>Accounting Horizons, 15</w:t>
+      </w:r>
+      <w:r>
+        <w:t>(3), 225–238.</w:t>
       </w:r>
     </w:p>
     <w:p>
@@ -3950,16 +3494,16 @@
         <w:pStyle w:val="ListBullet"/>
       </w:pPr>
       <w:r>
-        <w:t xml:space="preserve">Earley, C. E. (2001). Knowledge acquisition and knowledge use in auditing. </w:t>
+        <w:t xml:space="preserve">Epley, N., &amp; Gilovich, T. (2006). The anchoring-and-adjustment heuristic: Why the adjustments are insufficient. </w:t>
       </w:r>
       <w:r>
         <w:rPr>
           <w:i/>
         </w:rPr>
-        <w:t>Accounting Horizons, 15</w:t>
-      </w:r>
-      <w:r>
-        <w:t>(3), 225–238.</w:t>
+        <w:t>Psychological Science, 17</w:t>
+      </w:r>
+      <w:r>
+        <w:t>(4), 311–318.</w:t>
       </w:r>
     </w:p>
     <w:p>
@@ -3967,16 +3511,16 @@
         <w:pStyle w:val="ListBullet"/>
       </w:pPr>
       <w:r>
-        <w:t xml:space="preserve">Epley, N., &amp; Gilovich, T. (2006). The anchoring-and-adjustment heuristic: Why the adjustments are insufficient. </w:t>
+        <w:t xml:space="preserve">Evans, J. St. B. T. (2008). Dual-processing accounts of reasoning, judgment, and social cognition. </w:t>
       </w:r>
       <w:r>
         <w:rPr>
           <w:i/>
         </w:rPr>
-        <w:t>Psychological Science, 17</w:t>
-      </w:r>
-      <w:r>
-        <w:t>(4), 311–318.</w:t>
+        <w:t>Annual Review of Psychology, 59</w:t>
+      </w:r>
+      <w:r>
+        <w:t>, 255–278.</w:t>
       </w:r>
     </w:p>
     <w:p>
@@ -3984,16 +3528,16 @@
         <w:pStyle w:val="ListBullet"/>
       </w:pPr>
       <w:r>
-        <w:t xml:space="preserve">Evans, J. St. B. T. (2008). Dual-processing accounts of reasoning, judgment, and social cognition. </w:t>
+        <w:t xml:space="preserve">Francis, J. R. (2011). A framework for understanding and researching audit quality. </w:t>
       </w:r>
       <w:r>
         <w:rPr>
           <w:i/>
         </w:rPr>
-        <w:t>Annual Review of Psychology, 59</w:t>
-      </w:r>
-      <w:r>
-        <w:t>, 255–278.</w:t>
+        <w:t>Auditing: A Journal of Practice &amp; Theory, 30</w:t>
+      </w:r>
+      <w:r>
+        <w:t>(2), 125–152.</w:t>
       </w:r>
     </w:p>
     <w:p>
@@ -4001,16 +3545,16 @@
         <w:pStyle w:val="ListBullet"/>
       </w:pPr>
       <w:r>
-        <w:t xml:space="preserve">Francis, J. R. (2011). A framework for understanding and researching audit quality. </w:t>
+        <w:t xml:space="preserve">Furnham, A., &amp; Boo, H. C. (2011). A literature review of the anchoring effect. </w:t>
       </w:r>
       <w:r>
         <w:rPr>
           <w:i/>
         </w:rPr>
-        <w:t>Auditing: A Journal of Practice &amp; Theory, 30</w:t>
-      </w:r>
-      <w:r>
-        <w:t>(2), 125–152.</w:t>
+        <w:t>The Journal of Socio-Economics, 40</w:t>
+      </w:r>
+      <w:r>
+        <w:t>(1), 35–42.</w:t>
       </w:r>
     </w:p>
     <w:p>
@@ -4018,50 +3562,16 @@
         <w:pStyle w:val="ListBullet"/>
       </w:pPr>
       <w:r>
-        <w:t xml:space="preserve">Furnham, A., &amp; Boo, H. C. (2011). A literature review of the anchoring effect. </w:t>
+        <w:t xml:space="preserve">Hogarth, R. M., &amp; Einhorn, H. J. (1992). Order effects in belief updating: The belief-adjustment model. </w:t>
       </w:r>
       <w:r>
         <w:rPr>
           <w:i/>
         </w:rPr>
-        <w:t>The Journal of Socio-Economics, 40</w:t>
-      </w:r>
-      <w:r>
-        <w:t>(1), 35–42.</w:t>
-      </w:r>
-    </w:p>
-    <w:p>
-      <w:pPr>
-        <w:pStyle w:val="ListBullet"/>
-      </w:pPr>
-      <w:r>
-        <w:t xml:space="preserve">Hogarth, R. M., &amp; Einhorn, H. J. (1992). Order effects in belief updating: The belief-adjustment model. </w:t>
-      </w:r>
-      <w:r>
-        <w:rPr>
-          <w:i/>
-        </w:rPr>
         <w:t>Cognitive Psychology, 24</w:t>
       </w:r>
       <w:r>
         <w:t>(1), 1–55.</w:t>
-      </w:r>
-    </w:p>
-    <w:p>
-      <w:pPr>
-        <w:pStyle w:val="ListBullet"/>
-      </w:pPr>
-      <w:r>
-        <w:t xml:space="preserve">Hurtt, R. K. (2010). Development of a scale to measure professional skepticism. </w:t>
-      </w:r>
-      <w:r>
-        <w:rPr>
-          <w:i/>
-        </w:rPr>
-        <w:t>Auditing: A Journal of Practice &amp; Theory, 29</w:t>
-      </w:r>
-      <w:r>
-        <w:t>(1), 149–171.</w:t>
       </w:r>
     </w:p>
     <w:p>

</xml_diff>